<commit_message>
feat: add WebSocket real-time broadcasting for alerts
</commit_message>
<xml_diff>
--- a/New Microsoft Word Document.docx
+++ b/New Microsoft Word Document.docx
@@ -3,7 +3,6 @@
 <w:document xmlns:wpc="http://schemas.microsoft.com/office/word/2010/wordprocessingCanvas" xmlns:cx="http://schemas.microsoft.com/office/drawing/2014/chartex" xmlns:cx1="http://schemas.microsoft.com/office/drawing/2015/9/8/chartex" xmlns:cx2="http://schemas.microsoft.com/office/drawing/2015/10/21/chartex" xmlns:cx3="http://schemas.microsoft.com/office/drawing/2016/5/9/chartex" xmlns:cx4="http://schemas.microsoft.com/office/drawing/2016/5/10/chartex" xmlns:cx5="http://schemas.microsoft.com/office/drawing/2016/5/11/chartex" xmlns:cx6="http://schemas.microsoft.com/office/drawing/2016/5/12/chartex" xmlns:cx7="http://schemas.microsoft.com/office/drawing/2016/5/13/chartex" xmlns:cx8="http://schemas.microsoft.com/office/drawing/2016/5/14/chartex" xmlns:mc="http://schemas.openxmlformats.org/markup-compatibility/2006" xmlns:aink="http://schemas.microsoft.com/office/drawing/2016/ink" xmlns:am3d="http://schemas.microsoft.com/office/drawing/2017/model3d" xmlns:o="urn:schemas-microsoft-com:office:office" xmlns:oel="http://schemas.microsoft.com/office/2019/extlst" xmlns:r="http://schemas.openxmlformats.org/officeDocument/2006/relationships" xmlns:m="http://schemas.openxmlformats.org/officeDocument/2006/math" xmlns:v="urn:schemas-microsoft-com:vml" xmlns:wp14="http://schemas.microsoft.com/office/word/2010/wordprocessingDrawing" xmlns:wp="http://schemas.openxmlformats.org/drawingml/2006/wordprocessingDrawing" xmlns:w10="urn:schemas-microsoft-com:office:word" xmlns:w="http://schemas.openxmlformats.org/wordprocessingml/2006/main" xmlns:w14="http://schemas.microsoft.com/office/word/2010/wordml" xmlns:w15="http://schemas.microsoft.com/office/word/2012/wordml" xmlns:w16cex="http://schemas.microsoft.com/office/word/2018/wordml/cex" xmlns:w16cid="http://schemas.microsoft.com/office/word/2016/wordml/cid" xmlns:w16="http://schemas.microsoft.com/office/word/2018/wordml" xmlns:w16du="http://schemas.microsoft.com/office/word/2023/wordml/word16du" xmlns:w16sdtdh="http://schemas.microsoft.com/office/word/2020/wordml/sdtdatahash" xmlns:w16sdtfl="http://schemas.microsoft.com/office/word/2024/wordml/sdtformatlock" xmlns:w16se="http://schemas.microsoft.com/office/word/2015/wordml/symex" xmlns:wpg="http://schemas.microsoft.com/office/word/2010/wordprocessingGroup" xmlns:wpi="http://schemas.microsoft.com/office/word/2010/wordprocessingInk" xmlns:wne="http://schemas.microsoft.com/office/word/2006/wordml" xmlns:wps="http://schemas.microsoft.com/office/word/2010/wordprocessingShape" mc:Ignorable="w14 w15 w16se w16cid w16 w16cex w16sdtdh w16sdtfl w16du wp14">
   <w:body>
     <w:p>
-      <w:proofErr w:type="gramStart"/>
       <w:r>
         <w:t xml:space="preserve">  </w:t>
       </w:r>
@@ -14,25 +13,8 @@
         </w:rPr>
         <w:t>username</w:t>
       </w:r>
-      <w:proofErr w:type="gramEnd"/>
       <w:r>
-        <w:t xml:space="preserve"> box </w:t>
-      </w:r>
-      <w:proofErr w:type="spellStart"/>
-      <w:r>
-        <w:t>mein</w:t>
-      </w:r>
-      <w:proofErr w:type="spellEnd"/>
-      <w:r>
-        <w:t xml:space="preserve"> </w:t>
-      </w:r>
-      <w:proofErr w:type="spellStart"/>
-      <w:r>
-        <w:t>likho</w:t>
-      </w:r>
-      <w:proofErr w:type="spellEnd"/>
-      <w:r>
-        <w:t>:</w:t>
+        <w:t xml:space="preserve"> box mein likho:</w:t>
       </w:r>
       <w:r>
         <w:br/>
@@ -40,7 +22,6 @@
       </w:r>
     </w:p>
     <w:p>
-      <w:proofErr w:type="gramStart"/>
       <w:r>
         <w:t xml:space="preserve">  </w:t>
       </w:r>
@@ -51,31 +32,1084 @@
         </w:rPr>
         <w:t>password</w:t>
       </w:r>
-      <w:proofErr w:type="gramEnd"/>
       <w:r>
-        <w:t xml:space="preserve"> box </w:t>
-      </w:r>
-      <w:proofErr w:type="spellStart"/>
-      <w:r>
-        <w:t>mein</w:t>
-      </w:r>
-      <w:proofErr w:type="spellEnd"/>
-      <w:r>
-        <w:t xml:space="preserve"> </w:t>
-      </w:r>
-      <w:proofErr w:type="spellStart"/>
-      <w:r>
-        <w:t>likho</w:t>
-      </w:r>
-      <w:proofErr w:type="spellEnd"/>
-      <w:r>
-        <w:t>:</w:t>
+        <w:t xml:space="preserve"> box mein likho:</w:t>
       </w:r>
       <w:r>
         <w:br/>
         <w:t>admin123</w:t>
       </w:r>
     </w:p>
+    <w:p/>
+    <w:p/>
+    <w:tbl>
+      <w:tblPr>
+        <w:tblW w:w="10206" w:type="dxa"/>
+        <w:tblCellSpacing w:w="15" w:type="dxa"/>
+        <w:tblCellMar>
+          <w:top w:w="15" w:type="dxa"/>
+          <w:left w:w="15" w:type="dxa"/>
+          <w:bottom w:w="15" w:type="dxa"/>
+          <w:right w:w="15" w:type="dxa"/>
+        </w:tblCellMar>
+        <w:tblLook w:val="04A0" w:firstRow="1" w:lastRow="0" w:firstColumn="1" w:lastColumn="0" w:noHBand="0" w:noVBand="1"/>
+      </w:tblPr>
+      <w:tblGrid>
+        <w:gridCol w:w="555"/>
+        <w:gridCol w:w="1888"/>
+        <w:gridCol w:w="3245"/>
+        <w:gridCol w:w="3212"/>
+        <w:gridCol w:w="1306"/>
+      </w:tblGrid>
+      <w:tr>
+        <w:trPr>
+          <w:tblHeader/>
+          <w:tblCellSpacing w:w="15" w:type="dxa"/>
+        </w:trPr>
+        <w:tc>
+          <w:tcPr>
+            <w:tcW w:w="0" w:type="auto"/>
+            <w:vAlign w:val="center"/>
+            <w:hideMark/>
+          </w:tcPr>
+          <w:p>
+            <w:pPr>
+              <w:rPr>
+                <w:b/>
+                <w:bCs/>
+              </w:rPr>
+            </w:pPr>
+            <w:r>
+              <w:rPr>
+                <w:b/>
+                <w:bCs/>
+              </w:rPr>
+              <w:t>Day</w:t>
+            </w:r>
+          </w:p>
+        </w:tc>
+        <w:tc>
+          <w:tcPr>
+            <w:tcW w:w="0" w:type="auto"/>
+            <w:vAlign w:val="center"/>
+            <w:hideMark/>
+          </w:tcPr>
+          <w:p>
+            <w:pPr>
+              <w:rPr>
+                <w:b/>
+                <w:bCs/>
+              </w:rPr>
+            </w:pPr>
+            <w:r>
+              <w:rPr>
+                <w:b/>
+                <w:bCs/>
+              </w:rPr>
+              <w:t>Focus</w:t>
+            </w:r>
+          </w:p>
+        </w:tc>
+        <w:tc>
+          <w:tcPr>
+            <w:tcW w:w="0" w:type="auto"/>
+            <w:vAlign w:val="center"/>
+            <w:hideMark/>
+          </w:tcPr>
+          <w:p>
+            <w:pPr>
+              <w:rPr>
+                <w:b/>
+                <w:bCs/>
+              </w:rPr>
+            </w:pPr>
+            <w:r>
+              <w:rPr>
+                <w:b/>
+                <w:bCs/>
+              </w:rPr>
+              <w:t>What you should complete &amp; push</w:t>
+            </w:r>
+          </w:p>
+        </w:tc>
+        <w:tc>
+          <w:tcPr>
+            <w:tcW w:w="0" w:type="auto"/>
+            <w:vAlign w:val="center"/>
+            <w:hideMark/>
+          </w:tcPr>
+          <w:p>
+            <w:pPr>
+              <w:rPr>
+                <w:b/>
+                <w:bCs/>
+              </w:rPr>
+            </w:pPr>
+            <w:r>
+              <w:rPr>
+                <w:b/>
+                <w:bCs/>
+              </w:rPr>
+              <w:t>Commit Message Style</w:t>
+            </w:r>
+          </w:p>
+        </w:tc>
+        <w:tc>
+          <w:tcPr>
+            <w:tcW w:w="1216" w:type="dxa"/>
+          </w:tcPr>
+          <w:p>
+            <w:pPr>
+              <w:rPr>
+                <w:b/>
+                <w:bCs/>
+              </w:rPr>
+            </w:pPr>
+            <w:r>
+              <w:rPr>
+                <w:b/>
+                <w:bCs/>
+              </w:rPr>
+              <w:t>COMPLETED</w:t>
+            </w:r>
+          </w:p>
+        </w:tc>
+      </w:tr>
+      <w:tr>
+        <w:trPr>
+          <w:tblCellSpacing w:w="15" w:type="dxa"/>
+        </w:trPr>
+        <w:tc>
+          <w:tcPr>
+            <w:tcW w:w="0" w:type="auto"/>
+            <w:vAlign w:val="center"/>
+            <w:hideMark/>
+          </w:tcPr>
+          <w:p>
+            <w:r>
+              <w:rPr>
+                <w:b/>
+                <w:bCs/>
+              </w:rPr>
+              <w:t>Day 1</w:t>
+            </w:r>
+          </w:p>
+        </w:tc>
+        <w:tc>
+          <w:tcPr>
+            <w:tcW w:w="0" w:type="auto"/>
+            <w:vAlign w:val="center"/>
+            <w:hideMark/>
+          </w:tcPr>
+          <w:p>
+            <w:r>
+              <w:t>Project Setup + Backend Skeleton</w:t>
+            </w:r>
+          </w:p>
+        </w:tc>
+        <w:tc>
+          <w:tcPr>
+            <w:tcW w:w="0" w:type="auto"/>
+            <w:vAlign w:val="center"/>
+            <w:hideMark/>
+          </w:tcPr>
+          <w:p>
+            <w:r>
+              <w:t>- Create monorepo</w:t>
+            </w:r>
+            <w:r>
+              <w:br/>
+              <w:t>- FastAPI skeleton</w:t>
+            </w:r>
+            <w:r>
+              <w:br/>
+              <w:t>- PostgreSQL + SQLAlchemy + Alembic</w:t>
+            </w:r>
+            <w:r>
+              <w:br/>
+              <w:t>- Config, Redis connection</w:t>
+            </w:r>
+            <w:r>
+              <w:br/>
+              <w:t>- Basic User model + JWT auth</w:t>
+            </w:r>
+          </w:p>
+        </w:tc>
+        <w:tc>
+          <w:tcPr>
+            <w:tcW w:w="0" w:type="auto"/>
+            <w:vAlign w:val="center"/>
+            <w:hideMark/>
+          </w:tcPr>
+          <w:p>
+            <w:r>
+              <w:t>feat: initialize FastAPI backend with auth and database</w:t>
+            </w:r>
+          </w:p>
+        </w:tc>
+        <w:tc>
+          <w:tcPr>
+            <w:tcW w:w="1216" w:type="dxa"/>
+          </w:tcPr>
+          <w:p>
+            <w:r>
+              <w:rPr>
+                <w:highlight w:val="darkGreen"/>
+              </w:rPr>
+              <w:t>DONE</w:t>
+            </w:r>
+          </w:p>
+        </w:tc>
+      </w:tr>
+      <w:tr>
+        <w:trPr>
+          <w:tblCellSpacing w:w="15" w:type="dxa"/>
+        </w:trPr>
+        <w:tc>
+          <w:tcPr>
+            <w:tcW w:w="0" w:type="auto"/>
+            <w:vAlign w:val="center"/>
+            <w:hideMark/>
+          </w:tcPr>
+          <w:p>
+            <w:r>
+              <w:rPr>
+                <w:b/>
+                <w:bCs/>
+              </w:rPr>
+              <w:t>Day 2</w:t>
+            </w:r>
+          </w:p>
+        </w:tc>
+        <w:tc>
+          <w:tcPr>
+            <w:tcW w:w="0" w:type="auto"/>
+            <w:vAlign w:val="center"/>
+            <w:hideMark/>
+          </w:tcPr>
+          <w:p>
+            <w:r>
+              <w:t>Camera Registry (Core)</w:t>
+            </w:r>
+          </w:p>
+        </w:tc>
+        <w:tc>
+          <w:tcPr>
+            <w:tcW w:w="0" w:type="auto"/>
+            <w:vAlign w:val="center"/>
+            <w:hideMark/>
+          </w:tcPr>
+          <w:p>
+            <w:r>
+              <w:t>- Camera model + schemas</w:t>
+            </w:r>
+            <w:r>
+              <w:br/>
+              <w:t>- CRUD APIs (create, list, update, disable)</w:t>
+            </w:r>
+            <w:r>
+              <w:br/>
+              <w:t>- Basic search &amp; filter</w:t>
+            </w:r>
+            <w:r>
+              <w:br/>
+              <w:t>- Camera audit log</w:t>
+            </w:r>
+          </w:p>
+        </w:tc>
+        <w:tc>
+          <w:tcPr>
+            <w:tcW w:w="0" w:type="auto"/>
+            <w:vAlign w:val="center"/>
+            <w:hideMark/>
+          </w:tcPr>
+          <w:p>
+            <w:r>
+              <w:t>feat: implement camera registry with CRUD and audit logs</w:t>
+            </w:r>
+          </w:p>
+        </w:tc>
+        <w:tc>
+          <w:tcPr>
+            <w:tcW w:w="1216" w:type="dxa"/>
+          </w:tcPr>
+          <w:p>
+            <w:r>
+              <w:rPr>
+                <w:highlight w:val="darkGreen"/>
+              </w:rPr>
+              <w:t>DONE</w:t>
+            </w:r>
+          </w:p>
+        </w:tc>
+      </w:tr>
+      <w:tr>
+        <w:trPr>
+          <w:tblCellSpacing w:w="15" w:type="dxa"/>
+        </w:trPr>
+        <w:tc>
+          <w:tcPr>
+            <w:tcW w:w="0" w:type="auto"/>
+            <w:vAlign w:val="center"/>
+            <w:hideMark/>
+          </w:tcPr>
+          <w:p>
+            <w:r>
+              <w:rPr>
+                <w:b/>
+                <w:bCs/>
+              </w:rPr>
+              <w:t>Day 3</w:t>
+            </w:r>
+          </w:p>
+        </w:tc>
+        <w:tc>
+          <w:tcPr>
+            <w:tcW w:w="0" w:type="auto"/>
+            <w:vAlign w:val="center"/>
+            <w:hideMark/>
+          </w:tcPr>
+          <w:p>
+            <w:r>
+              <w:t>Watchlist + Detection Events</w:t>
+            </w:r>
+          </w:p>
+        </w:tc>
+        <w:tc>
+          <w:tcPr>
+            <w:tcW w:w="0" w:type="auto"/>
+            <w:vAlign w:val="center"/>
+            <w:hideMark/>
+          </w:tcPr>
+          <w:p>
+            <w:r>
+              <w:t>- Watchlist model + CRUD</w:t>
+            </w:r>
+            <w:r>
+              <w:br/>
+              <w:t>- Detection Event model</w:t>
+            </w:r>
+            <w:r>
+              <w:br/>
+              <w:t>- API to receive AI events</w:t>
+            </w:r>
+            <w:r>
+              <w:br/>
+              <w:t>- Basic validation</w:t>
+            </w:r>
+          </w:p>
+        </w:tc>
+        <w:tc>
+          <w:tcPr>
+            <w:tcW w:w="0" w:type="auto"/>
+            <w:vAlign w:val="center"/>
+            <w:hideMark/>
+          </w:tcPr>
+          <w:p>
+            <w:r>
+              <w:t>feat: add watchlist and detection event ingestion</w:t>
+            </w:r>
+          </w:p>
+        </w:tc>
+        <w:tc>
+          <w:tcPr>
+            <w:tcW w:w="1216" w:type="dxa"/>
+          </w:tcPr>
+          <w:p>
+            <w:r>
+              <w:rPr>
+                <w:highlight w:val="darkGreen"/>
+              </w:rPr>
+              <w:t>DONE</w:t>
+            </w:r>
+          </w:p>
+        </w:tc>
+      </w:tr>
+      <w:tr>
+        <w:trPr>
+          <w:tblCellSpacing w:w="15" w:type="dxa"/>
+        </w:trPr>
+        <w:tc>
+          <w:tcPr>
+            <w:tcW w:w="0" w:type="auto"/>
+            <w:vAlign w:val="center"/>
+            <w:hideMark/>
+          </w:tcPr>
+          <w:p>
+            <w:r>
+              <w:rPr>
+                <w:b/>
+                <w:bCs/>
+              </w:rPr>
+              <w:t>Day 4</w:t>
+            </w:r>
+          </w:p>
+        </w:tc>
+        <w:tc>
+          <w:tcPr>
+            <w:tcW w:w="0" w:type="auto"/>
+            <w:vAlign w:val="center"/>
+            <w:hideMark/>
+          </w:tcPr>
+          <w:p>
+            <w:r>
+              <w:t>Matching Engine + Alerts</w:t>
+            </w:r>
+          </w:p>
+        </w:tc>
+        <w:tc>
+          <w:tcPr>
+            <w:tcW w:w="0" w:type="auto"/>
+            <w:vAlign w:val="center"/>
+            <w:hideMark/>
+          </w:tcPr>
+          <w:p>
+            <w:r>
+              <w:t>- Matching service (event vs watchlist)</w:t>
+            </w:r>
+            <w:r>
+              <w:br/>
+              <w:t>- Alert creation</w:t>
+            </w:r>
+            <w:r>
+              <w:br/>
+              <w:t>- Alert status (open / acknowledged / resolved)</w:t>
+            </w:r>
+            <w:r>
+              <w:br/>
+              <w:t>- Deduplication logic</w:t>
+            </w:r>
+          </w:p>
+        </w:tc>
+        <w:tc>
+          <w:tcPr>
+            <w:tcW w:w="0" w:type="auto"/>
+            <w:vAlign w:val="center"/>
+            <w:hideMark/>
+          </w:tcPr>
+          <w:p>
+            <w:r>
+              <w:t>feat: implement watchlist matching and real-time alert generation</w:t>
+            </w:r>
+          </w:p>
+        </w:tc>
+        <w:tc>
+          <w:tcPr>
+            <w:tcW w:w="1216" w:type="dxa"/>
+          </w:tcPr>
+          <w:p>
+            <w:r>
+              <w:rPr>
+                <w:highlight w:val="darkGreen"/>
+              </w:rPr>
+              <w:t>DONE</w:t>
+            </w:r>
+          </w:p>
+        </w:tc>
+      </w:tr>
+      <w:tr>
+        <w:trPr>
+          <w:tblCellSpacing w:w="15" w:type="dxa"/>
+        </w:trPr>
+        <w:tc>
+          <w:tcPr>
+            <w:tcW w:w="0" w:type="auto"/>
+            <w:vAlign w:val="center"/>
+            <w:hideMark/>
+          </w:tcPr>
+          <w:p>
+            <w:r>
+              <w:rPr>
+                <w:b/>
+                <w:bCs/>
+              </w:rPr>
+              <w:t>Day 5</w:t>
+            </w:r>
+          </w:p>
+        </w:tc>
+        <w:tc>
+          <w:tcPr>
+            <w:tcW w:w="0" w:type="auto"/>
+            <w:vAlign w:val="center"/>
+            <w:hideMark/>
+          </w:tcPr>
+          <w:p>
+            <w:r>
+              <w:t>Real-time Layer</w:t>
+            </w:r>
+          </w:p>
+        </w:tc>
+        <w:tc>
+          <w:tcPr>
+            <w:tcW w:w="0" w:type="auto"/>
+            <w:vAlign w:val="center"/>
+            <w:hideMark/>
+          </w:tcPr>
+          <w:p>
+            <w:r>
+              <w:t>- Redis Pub/Sub</w:t>
+            </w:r>
+            <w:r>
+              <w:br/>
+              <w:t>- WebSocket manager</w:t>
+            </w:r>
+            <w:r>
+              <w:br/>
+              <w:t>- Broadcast new events &amp; alerts</w:t>
+            </w:r>
+            <w:r>
+              <w:br/>
+              <w:t>- Camera status updates</w:t>
+            </w:r>
+          </w:p>
+        </w:tc>
+        <w:tc>
+          <w:tcPr>
+            <w:tcW w:w="0" w:type="auto"/>
+            <w:vAlign w:val="center"/>
+            <w:hideMark/>
+          </w:tcPr>
+          <w:p>
+            <w:r>
+              <w:t>feat: add WebSocket + Redis real-time event broadcasting</w:t>
+            </w:r>
+          </w:p>
+        </w:tc>
+        <w:tc>
+          <w:tcPr>
+            <w:tcW w:w="1216" w:type="dxa"/>
+          </w:tcPr>
+          <w:p/>
+        </w:tc>
+      </w:tr>
+      <w:tr>
+        <w:trPr>
+          <w:tblCellSpacing w:w="15" w:type="dxa"/>
+        </w:trPr>
+        <w:tc>
+          <w:tcPr>
+            <w:tcW w:w="0" w:type="auto"/>
+            <w:vAlign w:val="center"/>
+            <w:hideMark/>
+          </w:tcPr>
+          <w:p>
+            <w:r>
+              <w:rPr>
+                <w:b/>
+                <w:bCs/>
+              </w:rPr>
+              <w:lastRenderedPageBreak/>
+              <w:t>Day 6</w:t>
+            </w:r>
+          </w:p>
+        </w:tc>
+        <w:tc>
+          <w:tcPr>
+            <w:tcW w:w="0" w:type="auto"/>
+            <w:vAlign w:val="center"/>
+            <w:hideMark/>
+          </w:tcPr>
+          <w:p>
+            <w:r>
+              <w:t>Frontend Foundation</w:t>
+            </w:r>
+          </w:p>
+        </w:tc>
+        <w:tc>
+          <w:tcPr>
+            <w:tcW w:w="0" w:type="auto"/>
+            <w:vAlign w:val="center"/>
+            <w:hideMark/>
+          </w:tcPr>
+          <w:p>
+            <w:r>
+              <w:t>- Next.js project setup</w:t>
+            </w:r>
+            <w:r>
+              <w:br/>
+              <w:t>- Auth pages (login)</w:t>
+            </w:r>
+            <w:r>
+              <w:br/>
+              <w:t>- Layout + protected routes</w:t>
+            </w:r>
+            <w:r>
+              <w:br/>
+              <w:t>- Basic dashboard shell</w:t>
+            </w:r>
+          </w:p>
+        </w:tc>
+        <w:tc>
+          <w:tcPr>
+            <w:tcW w:w="0" w:type="auto"/>
+            <w:vAlign w:val="center"/>
+            <w:hideMark/>
+          </w:tcPr>
+          <w:p>
+            <w:r>
+              <w:t>feat: initialize Next.js frontend with auth and dashboard layout</w:t>
+            </w:r>
+          </w:p>
+        </w:tc>
+        <w:tc>
+          <w:tcPr>
+            <w:tcW w:w="1216" w:type="dxa"/>
+          </w:tcPr>
+          <w:p/>
+        </w:tc>
+      </w:tr>
+      <w:tr>
+        <w:trPr>
+          <w:tblCellSpacing w:w="15" w:type="dxa"/>
+        </w:trPr>
+        <w:tc>
+          <w:tcPr>
+            <w:tcW w:w="0" w:type="auto"/>
+            <w:vAlign w:val="center"/>
+            <w:hideMark/>
+          </w:tcPr>
+          <w:p>
+            <w:r>
+              <w:rPr>
+                <w:b/>
+                <w:bCs/>
+              </w:rPr>
+              <w:t>Day 7</w:t>
+            </w:r>
+          </w:p>
+        </w:tc>
+        <w:tc>
+          <w:tcPr>
+            <w:tcW w:w="0" w:type="auto"/>
+            <w:vAlign w:val="center"/>
+            <w:hideMark/>
+          </w:tcPr>
+          <w:p>
+            <w:r>
+              <w:t>Camera &amp; Map Integration</w:t>
+            </w:r>
+          </w:p>
+        </w:tc>
+        <w:tc>
+          <w:tcPr>
+            <w:tcW w:w="0" w:type="auto"/>
+            <w:vAlign w:val="center"/>
+            <w:hideMark/>
+          </w:tcPr>
+          <w:p>
+            <w:r>
+              <w:t>- Camera list + filters</w:t>
+            </w:r>
+            <w:r>
+              <w:br/>
+              <w:t>- Interactive Leaflet map with markers</w:t>
+            </w:r>
+            <w:r>
+              <w:br/>
+              <w:t>- Status colors (online/offline/degraded)</w:t>
+            </w:r>
+            <w:r>
+              <w:br/>
+              <w:t>- Camera detail view</w:t>
+            </w:r>
+          </w:p>
+        </w:tc>
+        <w:tc>
+          <w:tcPr>
+            <w:tcW w:w="0" w:type="auto"/>
+            <w:vAlign w:val="center"/>
+            <w:hideMark/>
+          </w:tcPr>
+          <w:p>
+            <w:r>
+              <w:t>feat: add camera registry UI and interactive map</w:t>
+            </w:r>
+          </w:p>
+        </w:tc>
+        <w:tc>
+          <w:tcPr>
+            <w:tcW w:w="1216" w:type="dxa"/>
+          </w:tcPr>
+          <w:p/>
+        </w:tc>
+      </w:tr>
+      <w:tr>
+        <w:trPr>
+          <w:tblCellSpacing w:w="15" w:type="dxa"/>
+        </w:trPr>
+        <w:tc>
+          <w:tcPr>
+            <w:tcW w:w="0" w:type="auto"/>
+            <w:vAlign w:val="center"/>
+            <w:hideMark/>
+          </w:tcPr>
+          <w:p>
+            <w:r>
+              <w:rPr>
+                <w:b/>
+                <w:bCs/>
+              </w:rPr>
+              <w:t>Day 8</w:t>
+            </w:r>
+          </w:p>
+        </w:tc>
+        <w:tc>
+          <w:tcPr>
+            <w:tcW w:w="0" w:type="auto"/>
+            <w:vAlign w:val="center"/>
+            <w:hideMark/>
+          </w:tcPr>
+          <w:p>
+            <w:r>
+              <w:t>Live Dashboard + Video</w:t>
+            </w:r>
+          </w:p>
+        </w:tc>
+        <w:tc>
+          <w:tcPr>
+            <w:tcW w:w="0" w:type="auto"/>
+            <w:vAlign w:val="center"/>
+            <w:hideMark/>
+          </w:tcPr>
+          <w:p>
+            <w:r>
+              <w:t>- Live camera grid (HLS players)</w:t>
+            </w:r>
+            <w:r>
+              <w:br/>
+              <w:t>- System stats (online count, active alerts)</w:t>
+            </w:r>
+            <w:r>
+              <w:br/>
+              <w:t>- Sample video streams</w:t>
+            </w:r>
+          </w:p>
+        </w:tc>
+        <w:tc>
+          <w:tcPr>
+            <w:tcW w:w="0" w:type="auto"/>
+            <w:vAlign w:val="center"/>
+            <w:hideMark/>
+          </w:tcPr>
+          <w:p>
+            <w:r>
+              <w:t>feat: implement live camera grid and system health dashboard</w:t>
+            </w:r>
+          </w:p>
+        </w:tc>
+        <w:tc>
+          <w:tcPr>
+            <w:tcW w:w="1216" w:type="dxa"/>
+          </w:tcPr>
+          <w:p/>
+        </w:tc>
+      </w:tr>
+      <w:tr>
+        <w:trPr>
+          <w:tblCellSpacing w:w="15" w:type="dxa"/>
+        </w:trPr>
+        <w:tc>
+          <w:tcPr>
+            <w:tcW w:w="0" w:type="auto"/>
+            <w:vAlign w:val="center"/>
+            <w:hideMark/>
+          </w:tcPr>
+          <w:p>
+            <w:r>
+              <w:rPr>
+                <w:b/>
+                <w:bCs/>
+              </w:rPr>
+              <w:t>Day 9</w:t>
+            </w:r>
+          </w:p>
+        </w:tc>
+        <w:tc>
+          <w:tcPr>
+            <w:tcW w:w="0" w:type="auto"/>
+            <w:vAlign w:val="center"/>
+            <w:hideMark/>
+          </w:tcPr>
+          <w:p>
+            <w:r>
+              <w:t>Alerts + Movement History</w:t>
+            </w:r>
+          </w:p>
+        </w:tc>
+        <w:tc>
+          <w:tcPr>
+            <w:tcW w:w="0" w:type="auto"/>
+            <w:vAlign w:val="center"/>
+            <w:hideMark/>
+          </w:tcPr>
+          <w:p>
+            <w:r>
+              <w:t>- Real-time alerts panel</w:t>
+            </w:r>
+            <w:r>
+              <w:br/>
+              <w:t>- Acknowledge / Resolve alerts</w:t>
+            </w:r>
+            <w:r>
+              <w:br/>
+              <w:t>- Vehicle search → movement history on map</w:t>
+            </w:r>
+            <w:r>
+              <w:br/>
+              <w:t>- Timeline view</w:t>
+            </w:r>
+          </w:p>
+        </w:tc>
+        <w:tc>
+          <w:tcPr>
+            <w:tcW w:w="0" w:type="auto"/>
+            <w:vAlign w:val="center"/>
+            <w:hideMark/>
+          </w:tcPr>
+          <w:p>
+            <w:r>
+              <w:t>feat: add real-time alerts and vehicle movement history</w:t>
+            </w:r>
+          </w:p>
+        </w:tc>
+        <w:tc>
+          <w:tcPr>
+            <w:tcW w:w="1216" w:type="dxa"/>
+          </w:tcPr>
+          <w:p/>
+        </w:tc>
+      </w:tr>
+      <w:tr>
+        <w:trPr>
+          <w:tblCellSpacing w:w="15" w:type="dxa"/>
+        </w:trPr>
+        <w:tc>
+          <w:tcPr>
+            <w:tcW w:w="0" w:type="auto"/>
+            <w:vAlign w:val="center"/>
+            <w:hideMark/>
+          </w:tcPr>
+          <w:p>
+            <w:r>
+              <w:rPr>
+                <w:b/>
+                <w:bCs/>
+              </w:rPr>
+              <w:t>Day 10</w:t>
+            </w:r>
+          </w:p>
+        </w:tc>
+        <w:tc>
+          <w:tcPr>
+            <w:tcW w:w="0" w:type="auto"/>
+            <w:vAlign w:val="center"/>
+            <w:hideMark/>
+          </w:tcPr>
+          <w:p>
+            <w:r>
+              <w:t>Polish + Docker + Docs</w:t>
+            </w:r>
+          </w:p>
+        </w:tc>
+        <w:tc>
+          <w:tcPr>
+            <w:tcW w:w="0" w:type="auto"/>
+            <w:vAlign w:val="center"/>
+            <w:hideMark/>
+          </w:tcPr>
+          <w:p>
+            <w:r>
+              <w:t>- Docker Compose</w:t>
+            </w:r>
+            <w:r>
+              <w:br/>
+              <w:t>- Environment variables</w:t>
+            </w:r>
+            <w:r>
+              <w:br/>
+              <w:t>- README (setup, architecture, limitations)</w:t>
+            </w:r>
+            <w:r>
+              <w:br/>
+              <w:t>- OpenAPI docs check</w:t>
+            </w:r>
+            <w:r>
+              <w:br/>
+              <w:t>- Basic seed data</w:t>
+            </w:r>
+          </w:p>
+        </w:tc>
+        <w:tc>
+          <w:tcPr>
+            <w:tcW w:w="0" w:type="auto"/>
+            <w:vAlign w:val="center"/>
+            <w:hideMark/>
+          </w:tcPr>
+          <w:p>
+            <w:r>
+              <w:t>feat: add Docker, documentation and seed data</w:t>
+            </w:r>
+          </w:p>
+        </w:tc>
+        <w:tc>
+          <w:tcPr>
+            <w:tcW w:w="1216" w:type="dxa"/>
+          </w:tcPr>
+          <w:p/>
+        </w:tc>
+      </w:tr>
+      <w:tr>
+        <w:trPr>
+          <w:tblCellSpacing w:w="15" w:type="dxa"/>
+        </w:trPr>
+        <w:tc>
+          <w:tcPr>
+            <w:tcW w:w="0" w:type="auto"/>
+            <w:vAlign w:val="center"/>
+            <w:hideMark/>
+          </w:tcPr>
+          <w:p>
+            <w:r>
+              <w:rPr>
+                <w:b/>
+                <w:bCs/>
+              </w:rPr>
+              <w:t>Day 11</w:t>
+            </w:r>
+          </w:p>
+        </w:tc>
+        <w:tc>
+          <w:tcPr>
+            <w:tcW w:w="0" w:type="auto"/>
+            <w:vAlign w:val="center"/>
+            <w:hideMark/>
+          </w:tcPr>
+          <w:p>
+            <w:r>
+              <w:t>Final Testing + Demo Prep</w:t>
+            </w:r>
+          </w:p>
+        </w:tc>
+        <w:tc>
+          <w:tcPr>
+            <w:tcW w:w="0" w:type="auto"/>
+            <w:vAlign w:val="center"/>
+            <w:hideMark/>
+          </w:tcPr>
+          <w:p>
+            <w:r>
+              <w:t>- End-to-end flow testing</w:t>
+            </w:r>
+            <w:r>
+              <w:br/>
+              <w:t>- Fix bugs</w:t>
+            </w:r>
+            <w:r>
+              <w:br/>
+              <w:t>- Record 3–5 min demo video</w:t>
+            </w:r>
+            <w:r>
+              <w:br/>
+              <w:t>- Architecture diagram</w:t>
+            </w:r>
+          </w:p>
+        </w:tc>
+        <w:tc>
+          <w:tcPr>
+            <w:tcW w:w="0" w:type="auto"/>
+            <w:vAlign w:val="center"/>
+            <w:hideMark/>
+          </w:tcPr>
+          <w:p>
+            <w:r>
+              <w:t>chore: final testing, demo video and architecture diagram</w:t>
+            </w:r>
+          </w:p>
+        </w:tc>
+        <w:tc>
+          <w:tcPr>
+            <w:tcW w:w="1216" w:type="dxa"/>
+          </w:tcPr>
+          <w:p/>
+        </w:tc>
+      </w:tr>
+      <w:tr>
+        <w:trPr>
+          <w:tblCellSpacing w:w="15" w:type="dxa"/>
+        </w:trPr>
+        <w:tc>
+          <w:tcPr>
+            <w:tcW w:w="0" w:type="auto"/>
+            <w:vAlign w:val="center"/>
+            <w:hideMark/>
+          </w:tcPr>
+          <w:p>
+            <w:r>
+              <w:rPr>
+                <w:b/>
+                <w:bCs/>
+              </w:rPr>
+              <w:t>Day 12</w:t>
+            </w:r>
+          </w:p>
+        </w:tc>
+        <w:tc>
+          <w:tcPr>
+            <w:tcW w:w="0" w:type="auto"/>
+            <w:vAlign w:val="center"/>
+            <w:hideMark/>
+          </w:tcPr>
+          <w:p>
+            <w:r>
+              <w:t>Submission Polish</w:t>
+            </w:r>
+          </w:p>
+        </w:tc>
+        <w:tc>
+          <w:tcPr>
+            <w:tcW w:w="0" w:type="auto"/>
+            <w:vAlign w:val="center"/>
+            <w:hideMark/>
+          </w:tcPr>
+          <w:p>
+            <w:r>
+              <w:t>- Clean Git history</w:t>
+            </w:r>
+            <w:r>
+              <w:br/>
+              <w:t>- Final README polish</w:t>
+            </w:r>
+            <w:r>
+              <w:br/>
+              <w:t>- Scalability &amp; security notes</w:t>
+            </w:r>
+            <w:r>
+              <w:br/>
+              <w:t>- Prepare submission email</w:t>
+            </w:r>
+          </w:p>
+        </w:tc>
+        <w:tc>
+          <w:tcPr>
+            <w:tcW w:w="0" w:type="auto"/>
+            <w:vAlign w:val="center"/>
+            <w:hideMark/>
+          </w:tcPr>
+          <w:p>
+            <w:r>
+              <w:t>docs: finalize README, scalability notes and submission package</w:t>
+            </w:r>
+          </w:p>
+        </w:tc>
+        <w:tc>
+          <w:tcPr>
+            <w:tcW w:w="1216" w:type="dxa"/>
+          </w:tcPr>
+          <w:p/>
+        </w:tc>
+      </w:tr>
+    </w:tbl>
+    <w:p/>
     <w:sectPr>
       <w:pgSz w:w="11906" w:h="16838"/>
       <w:pgMar w:top="1440" w:right="1440" w:bottom="1440" w:left="1440" w:header="708" w:footer="708" w:gutter="0"/>

</xml_diff>

<commit_message>
feat: add cameras page with list and Leaflet map
</commit_message>
<xml_diff>
--- a/New Microsoft Word Document.docx
+++ b/New Microsoft Word Document.docx
@@ -3,6 +3,7 @@
 <w:document xmlns:wpc="http://schemas.microsoft.com/office/word/2010/wordprocessingCanvas" xmlns:cx="http://schemas.microsoft.com/office/drawing/2014/chartex" xmlns:cx1="http://schemas.microsoft.com/office/drawing/2015/9/8/chartex" xmlns:cx2="http://schemas.microsoft.com/office/drawing/2015/10/21/chartex" xmlns:cx3="http://schemas.microsoft.com/office/drawing/2016/5/9/chartex" xmlns:cx4="http://schemas.microsoft.com/office/drawing/2016/5/10/chartex" xmlns:cx5="http://schemas.microsoft.com/office/drawing/2016/5/11/chartex" xmlns:cx6="http://schemas.microsoft.com/office/drawing/2016/5/12/chartex" xmlns:cx7="http://schemas.microsoft.com/office/drawing/2016/5/13/chartex" xmlns:cx8="http://schemas.microsoft.com/office/drawing/2016/5/14/chartex" xmlns:mc="http://schemas.openxmlformats.org/markup-compatibility/2006" xmlns:aink="http://schemas.microsoft.com/office/drawing/2016/ink" xmlns:am3d="http://schemas.microsoft.com/office/drawing/2017/model3d" xmlns:o="urn:schemas-microsoft-com:office:office" xmlns:oel="http://schemas.microsoft.com/office/2019/extlst" xmlns:r="http://schemas.openxmlformats.org/officeDocument/2006/relationships" xmlns:m="http://schemas.openxmlformats.org/officeDocument/2006/math" xmlns:v="urn:schemas-microsoft-com:vml" xmlns:wp14="http://schemas.microsoft.com/office/word/2010/wordprocessingDrawing" xmlns:wp="http://schemas.openxmlformats.org/drawingml/2006/wordprocessingDrawing" xmlns:w10="urn:schemas-microsoft-com:office:word" xmlns:w="http://schemas.openxmlformats.org/wordprocessingml/2006/main" xmlns:w14="http://schemas.microsoft.com/office/word/2010/wordml" xmlns:w15="http://schemas.microsoft.com/office/word/2012/wordml" xmlns:w16cex="http://schemas.microsoft.com/office/word/2018/wordml/cex" xmlns:w16cid="http://schemas.microsoft.com/office/word/2016/wordml/cid" xmlns:w16="http://schemas.microsoft.com/office/word/2018/wordml" xmlns:w16du="http://schemas.microsoft.com/office/word/2023/wordml/word16du" xmlns:w16sdtdh="http://schemas.microsoft.com/office/word/2020/wordml/sdtdatahash" xmlns:w16sdtfl="http://schemas.microsoft.com/office/word/2024/wordml/sdtformatlock" xmlns:w16se="http://schemas.microsoft.com/office/word/2015/wordml/symex" xmlns:wpg="http://schemas.microsoft.com/office/word/2010/wordprocessingGroup" xmlns:wpi="http://schemas.microsoft.com/office/word/2010/wordprocessingInk" xmlns:wne="http://schemas.microsoft.com/office/word/2006/wordml" xmlns:wps="http://schemas.microsoft.com/office/word/2010/wordprocessingShape" mc:Ignorable="w14 w15 w16se w16cid w16 w16cex w16sdtdh w16sdtfl w16du wp14">
   <w:body>
     <w:p>
+      <w:proofErr w:type="gramStart"/>
       <w:r>
         <w:t xml:space="preserve">  </w:t>
       </w:r>
@@ -13,8 +14,25 @@
         </w:rPr>
         <w:t>username</w:t>
       </w:r>
+      <w:proofErr w:type="gramEnd"/>
       <w:r>
-        <w:t xml:space="preserve"> box mein likho:</w:t>
+        <w:t xml:space="preserve"> box </w:t>
+      </w:r>
+      <w:proofErr w:type="spellStart"/>
+      <w:r>
+        <w:t>mein</w:t>
+      </w:r>
+      <w:proofErr w:type="spellEnd"/>
+      <w:r>
+        <w:t xml:space="preserve"> </w:t>
+      </w:r>
+      <w:proofErr w:type="spellStart"/>
+      <w:r>
+        <w:t>likho</w:t>
+      </w:r>
+      <w:proofErr w:type="spellEnd"/>
+      <w:r>
+        <w:t>:</w:t>
       </w:r>
       <w:r>
         <w:br/>
@@ -22,6 +40,7 @@
       </w:r>
     </w:p>
     <w:p>
+      <w:proofErr w:type="gramStart"/>
       <w:r>
         <w:t xml:space="preserve">  </w:t>
       </w:r>
@@ -32,8 +51,25 @@
         </w:rPr>
         <w:t>password</w:t>
       </w:r>
+      <w:proofErr w:type="gramEnd"/>
       <w:r>
-        <w:t xml:space="preserve"> box mein likho:</w:t>
+        <w:t xml:space="preserve"> box </w:t>
+      </w:r>
+      <w:proofErr w:type="spellStart"/>
+      <w:r>
+        <w:t>mein</w:t>
+      </w:r>
+      <w:proofErr w:type="spellEnd"/>
+      <w:r>
+        <w:t xml:space="preserve"> </w:t>
+      </w:r>
+      <w:proofErr w:type="spellStart"/>
+      <w:r>
+        <w:t>likho</w:t>
+      </w:r>
+      <w:proofErr w:type="spellEnd"/>
+      <w:r>
+        <w:t>:</w:t>
       </w:r>
       <w:r>
         <w:br/>
@@ -156,7 +192,7 @@
         </w:tc>
         <w:tc>
           <w:tcPr>
-            <w:tcW w:w="1216" w:type="dxa"/>
+            <w:tcW w:w="1261" w:type="dxa"/>
           </w:tcPr>
           <w:p>
             <w:pPr>
@@ -215,15 +251,36 @@
           </w:tcPr>
           <w:p>
             <w:r>
-              <w:t>- Create monorepo</w:t>
-            </w:r>
-            <w:r>
-              <w:br/>
-              <w:t>- FastAPI skeleton</w:t>
-            </w:r>
-            <w:r>
-              <w:br/>
-              <w:t>- PostgreSQL + SQLAlchemy + Alembic</w:t>
+              <w:t xml:space="preserve">- Create </w:t>
+            </w:r>
+            <w:proofErr w:type="spellStart"/>
+            <w:r>
+              <w:t>monorepo</w:t>
+            </w:r>
+            <w:proofErr w:type="spellEnd"/>
+            <w:r>
+              <w:br/>
+              <w:t xml:space="preserve">- </w:t>
+            </w:r>
+            <w:proofErr w:type="spellStart"/>
+            <w:r>
+              <w:t>FastAPI</w:t>
+            </w:r>
+            <w:proofErr w:type="spellEnd"/>
+            <w:r>
+              <w:t xml:space="preserve"> skeleton</w:t>
+            </w:r>
+            <w:r>
+              <w:br/>
+              <w:t xml:space="preserve">- PostgreSQL + </w:t>
+            </w:r>
+            <w:proofErr w:type="spellStart"/>
+            <w:r>
+              <w:t>SQLAlchemy</w:t>
+            </w:r>
+            <w:proofErr w:type="spellEnd"/>
+            <w:r>
+              <w:t xml:space="preserve"> + Alembic</w:t>
             </w:r>
             <w:r>
               <w:br/>
@@ -243,15 +300,26 @@
           </w:tcPr>
           <w:p>
             <w:r>
-              <w:t>feat: initialize FastAPI backend with auth and database</w:t>
-            </w:r>
-          </w:p>
-        </w:tc>
-        <w:tc>
-          <w:tcPr>
-            <w:tcW w:w="1216" w:type="dxa"/>
-          </w:tcPr>
-          <w:p>
+              <w:t xml:space="preserve">feat: initialize </w:t>
+            </w:r>
+            <w:proofErr w:type="spellStart"/>
+            <w:r>
+              <w:t>FastAPI</w:t>
+            </w:r>
+            <w:proofErr w:type="spellEnd"/>
+            <w:r>
+              <w:t xml:space="preserve"> backend with auth and database</w:t>
+            </w:r>
+          </w:p>
+        </w:tc>
+        <w:tc>
+          <w:tcPr>
+            <w:tcW w:w="1261" w:type="dxa"/>
+          </w:tcPr>
+          <w:p>
+            <w:pPr>
+              <w:jc w:val="center"/>
+            </w:pPr>
             <w:r>
               <w:rPr>
                 <w:highlight w:val="darkGreen"/>
@@ -331,9 +399,12 @@
         </w:tc>
         <w:tc>
           <w:tcPr>
-            <w:tcW w:w="1216" w:type="dxa"/>
-          </w:tcPr>
-          <w:p>
+            <w:tcW w:w="1261" w:type="dxa"/>
+          </w:tcPr>
+          <w:p>
+            <w:pPr>
+              <w:jc w:val="center"/>
+            </w:pPr>
             <w:r>
               <w:rPr>
                 <w:highlight w:val="darkGreen"/>
@@ -413,9 +484,12 @@
         </w:tc>
         <w:tc>
           <w:tcPr>
-            <w:tcW w:w="1216" w:type="dxa"/>
-          </w:tcPr>
-          <w:p>
+            <w:tcW w:w="1261" w:type="dxa"/>
+          </w:tcPr>
+          <w:p>
+            <w:pPr>
+              <w:jc w:val="center"/>
+            </w:pPr>
             <w:r>
               <w:rPr>
                 <w:highlight w:val="darkGreen"/>
@@ -495,9 +569,12 @@
         </w:tc>
         <w:tc>
           <w:tcPr>
-            <w:tcW w:w="1216" w:type="dxa"/>
-          </w:tcPr>
-          <w:p>
+            <w:tcW w:w="1261" w:type="dxa"/>
+          </w:tcPr>
+          <w:p>
+            <w:pPr>
+              <w:jc w:val="center"/>
+            </w:pPr>
             <w:r>
               <w:rPr>
                 <w:highlight w:val="darkGreen"/>
@@ -577,9 +654,19 @@
         </w:tc>
         <w:tc>
           <w:tcPr>
-            <w:tcW w:w="1216" w:type="dxa"/>
-          </w:tcPr>
-          <w:p/>
+            <w:tcW w:w="1261" w:type="dxa"/>
+          </w:tcPr>
+          <w:p>
+            <w:pPr>
+              <w:jc w:val="center"/>
+            </w:pPr>
+            <w:r>
+              <w:rPr>
+                <w:highlight w:val="darkGreen"/>
+              </w:rPr>
+              <w:t>DONE</w:t>
+            </w:r>
+          </w:p>
         </w:tc>
       </w:tr>
       <w:tr>
@@ -653,9 +740,19 @@
         </w:tc>
         <w:tc>
           <w:tcPr>
-            <w:tcW w:w="1216" w:type="dxa"/>
-          </w:tcPr>
-          <w:p/>
+            <w:tcW w:w="1261" w:type="dxa"/>
+          </w:tcPr>
+          <w:p>
+            <w:pPr>
+              <w:jc w:val="center"/>
+            </w:pPr>
+            <w:r>
+              <w:rPr>
+                <w:highlight w:val="darkGreen"/>
+              </w:rPr>
+              <w:t>DONE</w:t>
+            </w:r>
+          </w:p>
         </w:tc>
       </w:tr>
       <w:tr>
@@ -706,7 +803,15 @@
             </w:r>
             <w:r>
               <w:br/>
-              <w:t>- Status colors (online/offline/degraded)</w:t>
+              <w:t xml:space="preserve">- Status </w:t>
+            </w:r>
+            <w:proofErr w:type="spellStart"/>
+            <w:r>
+              <w:t>colors</w:t>
+            </w:r>
+            <w:proofErr w:type="spellEnd"/>
+            <w:r>
+              <w:t xml:space="preserve"> (online/offline/degraded)</w:t>
             </w:r>
             <w:r>
               <w:br/>
@@ -728,7 +833,7 @@
         </w:tc>
         <w:tc>
           <w:tcPr>
-            <w:tcW w:w="1216" w:type="dxa"/>
+            <w:tcW w:w="1261" w:type="dxa"/>
           </w:tcPr>
           <w:p/>
         </w:tc>
@@ -799,7 +904,7 @@
         </w:tc>
         <w:tc>
           <w:tcPr>
-            <w:tcW w:w="1216" w:type="dxa"/>
+            <w:tcW w:w="1261" w:type="dxa"/>
           </w:tcPr>
           <w:p/>
         </w:tc>
@@ -874,7 +979,7 @@
         </w:tc>
         <w:tc>
           <w:tcPr>
-            <w:tcW w:w="1216" w:type="dxa"/>
+            <w:tcW w:w="1261" w:type="dxa"/>
           </w:tcPr>
           <w:p/>
         </w:tc>
@@ -931,7 +1036,15 @@
             </w:r>
             <w:r>
               <w:br/>
-              <w:t>- OpenAPI docs check</w:t>
+              <w:t xml:space="preserve">- </w:t>
+            </w:r>
+            <w:proofErr w:type="spellStart"/>
+            <w:r>
+              <w:t>OpenAPI</w:t>
+            </w:r>
+            <w:proofErr w:type="spellEnd"/>
+            <w:r>
+              <w:t xml:space="preserve"> docs check</w:t>
             </w:r>
             <w:r>
               <w:br/>
@@ -953,7 +1066,7 @@
         </w:tc>
         <w:tc>
           <w:tcPr>
-            <w:tcW w:w="1216" w:type="dxa"/>
+            <w:tcW w:w="1261" w:type="dxa"/>
           </w:tcPr>
           <w:p/>
         </w:tc>
@@ -1028,7 +1141,7 @@
         </w:tc>
         <w:tc>
           <w:tcPr>
-            <w:tcW w:w="1216" w:type="dxa"/>
+            <w:tcW w:w="1261" w:type="dxa"/>
           </w:tcPr>
           <w:p/>
         </w:tc>
@@ -1103,7 +1216,7 @@
         </w:tc>
         <w:tc>
           <w:tcPr>
-            <w:tcW w:w="1216" w:type="dxa"/>
+            <w:tcW w:w="1261" w:type="dxa"/>
           </w:tcPr>
           <w:p/>
         </w:tc>

</xml_diff>

<commit_message>
feat: enhance dashboard with live stats and recent alerts
</commit_message>
<xml_diff>
--- a/New Microsoft Word Document.docx
+++ b/New Microsoft Word Document.docx
@@ -835,7 +835,17 @@
           <w:tcPr>
             <w:tcW w:w="1261" w:type="dxa"/>
           </w:tcPr>
-          <w:p/>
+          <w:p>
+            <w:pPr>
+              <w:jc w:val="center"/>
+            </w:pPr>
+            <w:r>
+              <w:rPr>
+                <w:highlight w:val="darkGreen"/>
+              </w:rPr>
+              <w:t>DONE</w:t>
+            </w:r>
+          </w:p>
         </w:tc>
       </w:tr>
       <w:tr>

</xml_diff>

<commit_message>
chore: add .env.example files for backend and frontend
</commit_message>
<xml_diff>
--- a/New Microsoft Word Document.docx
+++ b/New Microsoft Word Document.docx
@@ -77,6 +77,31 @@
       </w:r>
     </w:p>
     <w:p/>
+    <w:p>
+      <w:r>
+        <w:t xml:space="preserve">git </w:t>
+      </w:r>
+      <w:proofErr w:type="gramStart"/>
+      <w:r>
+        <w:t>add .</w:t>
+      </w:r>
+      <w:proofErr w:type="gramEnd"/>
+      <w:r>
+        <w:t xml:space="preserve"> </w:t>
+      </w:r>
+    </w:p>
+    <w:p>
+      <w:r>
+        <w:t xml:space="preserve">git commit -m "docs: professional README and final submission polish" </w:t>
+      </w:r>
+    </w:p>
+    <w:p>
+      <w:r>
+        <w:t>git push</w:t>
+      </w:r>
+    </w:p>
+    <w:p/>
+    <w:p/>
     <w:p/>
     <w:tbl>
       <w:tblPr>
@@ -547,7 +572,11 @@
             </w:r>
             <w:r>
               <w:br/>
-              <w:t>- Alert status (open / acknowledged / resolved)</w:t>
+              <w:t xml:space="preserve">- Alert status (open / </w:t>
+            </w:r>
+            <w:r>
+              <w:lastRenderedPageBreak/>
+              <w:t>acknowledged / resolved)</w:t>
             </w:r>
             <w:r>
               <w:br/>
@@ -563,6 +592,7 @@
           </w:tcPr>
           <w:p>
             <w:r>
+              <w:lastRenderedPageBreak/>
               <w:t>feat: implement watchlist matching and real-time alert generation</w:t>
             </w:r>
           </w:p>
@@ -685,7 +715,6 @@
                 <w:b/>
                 <w:bCs/>
               </w:rPr>
-              <w:lastRenderedPageBreak/>
               <w:t>Day 6</w:t>
             </w:r>
           </w:p>
@@ -916,7 +945,17 @@
           <w:tcPr>
             <w:tcW w:w="1261" w:type="dxa"/>
           </w:tcPr>
-          <w:p/>
+          <w:p>
+            <w:pPr>
+              <w:jc w:val="center"/>
+            </w:pPr>
+            <w:r>
+              <w:rPr>
+                <w:highlight w:val="darkGreen"/>
+              </w:rPr>
+              <w:t>DONE</w:t>
+            </w:r>
+          </w:p>
         </w:tc>
       </w:tr>
       <w:tr>
@@ -991,7 +1030,17 @@
           <w:tcPr>
             <w:tcW w:w="1261" w:type="dxa"/>
           </w:tcPr>
-          <w:p/>
+          <w:p>
+            <w:pPr>
+              <w:jc w:val="center"/>
+            </w:pPr>
+            <w:r>
+              <w:rPr>
+                <w:highlight w:val="darkGreen"/>
+              </w:rPr>
+              <w:t>DONE</w:t>
+            </w:r>
+          </w:p>
         </w:tc>
       </w:tr>
       <w:tr>
@@ -1129,6 +1178,9 @@
             </w:r>
             <w:r>
               <w:br/>
+            </w:r>
+            <w:r>
+              <w:lastRenderedPageBreak/>
               <w:t>- Record 3–5 min demo video</w:t>
             </w:r>
             <w:r>
@@ -1145,6 +1197,7 @@
           </w:tcPr>
           <w:p>
             <w:r>
+              <w:lastRenderedPageBreak/>
               <w:t>chore: final testing, demo video and architecture diagram</w:t>
             </w:r>
           </w:p>

</xml_diff>